<commit_message>
fixed bugs and features
</commit_message>
<xml_diff>
--- a/Mathematical Expression Interpreter Report.docx
+++ b/Mathematical Expression Interpreter Report.docx
@@ -29,6 +29,9 @@
     <w:p>
       <w:pPr>
         <w:jc w:val="center"/>
+        <w:rPr>
+          <w:sz w:val="24"/>
+        </w:rPr>
       </w:pPr>
       <w:r>
         <w:rPr>
@@ -36,17 +39,33 @@
         </w:rPr>
         <w:t>Maher Aboudiab</w:t>
       </w:r>
+      <w:r>
+        <w:rPr>
+          <w:sz w:val="24"/>
+        </w:rPr>
+        <w:t>, Myriam Saidy</w:t>
+      </w:r>
+    </w:p>
+    <w:p>
+      <w:pPr>
+        <w:jc w:val="center"/>
+        <w:rPr>
+          <w:sz w:val="24"/>
+        </w:rPr>
+      </w:pPr>
+    </w:p>
+    <w:p>
+      <w:pPr>
+        <w:jc w:val="center"/>
+        <w:rPr>
+          <w:sz w:val="24"/>
+        </w:rPr>
+      </w:pPr>
     </w:p>
     <w:p>
       <w:pPr>
         <w:jc w:val="center"/>
       </w:pPr>
-      <w:r>
-        <w:rPr>
-          <w:sz w:val="24"/>
-        </w:rPr>
-        <w:t>May 1, 2026</w:t>
-      </w:r>
     </w:p>
     <w:p>
       <w:pPr>
@@ -61,10 +80,7 @@
     </w:p>
     <w:p>
       <w:r>
-        <w:t>T</w:t>
-      </w:r>
-      <w:r>
-        <w:t>his project implements a complete interpreter for a custom mathematical expression language, built entirely in JavaScript and executed in the browser with no server or build step required. The application demonstrates the core concepts of language processing: lexical analysis, syntactic analysis, and tree-walking evaluation, with every internal stage exposed to the user through live, interactive panels in the browser UI.</w:t>
+        <w:t>This project implements a complete interpreter for a custom mathematical expression language, built entirely in JavaScript and executed in the browser with no server or build step required. The application demonstrates the core concepts of language processing: lexical analysis, syntactic analysis, and tree-walking evaluation, with every internal stage exposed to the user through live, interactive panels in the browser UI.</w:t>
       </w:r>
     </w:p>
     <w:p>
@@ -811,14 +827,7 @@
           <w:sz w:val="18"/>
         </w:rPr>
         <w:br/>
-        <w:t xml:space="preserve">          | ('sqrt'|'abs'|'floo</w:t>
-      </w:r>
-      <w:r>
-        <w:rPr>
-          <w:rFonts w:ascii="Courier New" w:hAnsi="Courier New"/>
-          <w:sz w:val="18"/>
-        </w:rPr>
-        <w:t>r'|'ceil') '(' expr ')'</w:t>
+        <w:t xml:space="preserve">          | ('sqrt'|'abs'|'floor'|'ceil') '(' expr ')'</w:t>
       </w:r>
     </w:p>
     <w:p>
@@ -2945,12 +2954,6 @@
           <w:sz w:val="18"/>
         </w:rPr>
         <w:br/>
-      </w:r>
-      <w:r>
-        <w:rPr>
-          <w:rFonts w:ascii="Courier New" w:hAnsi="Courier New"/>
-          <w:sz w:val="18"/>
-        </w:rPr>
         <w:t>for (i = 1 to 5) {</w:t>
       </w:r>
       <w:r>
@@ -3184,14 +3187,7 @@
           <w:sz w:val="18"/>
         </w:rPr>
         <w:br/>
-        <w:t>│   ├── sql_parser.js   SQL Stage 2 — SQL pars</w:t>
-      </w:r>
-      <w:r>
-        <w:rPr>
-          <w:rFonts w:ascii="Courier New" w:hAnsi="Courier New"/>
-          <w:sz w:val="18"/>
-        </w:rPr>
-        <w:t>er and AST nodes</w:t>
+        <w:t>│   ├── sql_parser.js   SQL Stage 2 — SQL parser and AST nodes</w:t>
       </w:r>
       <w:r>
         <w:rPr>

</xml_diff>